<commit_message>
sync: linux app from main (2026-06-24 01:08)
</commit_message>
<xml_diff>
--- a/linux_port/app/bundle/ИНСТРУКЦИЯ_оформление_протоколов_Минтруд.docx
+++ b/linux_port/app/bundle/ИНСТРУКЦИЯ_оформление_протоколов_Минтруд.docx
@@ -217,6 +217,15 @@
         <w:t>`Data_base.xlsx`</w:t>
       </w:r>
       <w:r>
+        <w:t xml:space="preserve"> или </w:t>
+      </w:r>
+      <w:r>
+        <w:rPr>
+          <w:b/>
+        </w:rPr>
+        <w:t>`Data_base.ods`</w:t>
+      </w:r>
+      <w:r>
         <w:t xml:space="preserve"> (в папке данных программы или путь в </w:t>
       </w:r>
       <w:r>
@@ -249,7 +258,25 @@
         <w:t>читает из Excel</w:t>
       </w:r>
       <w:r>
-        <w:t>; в SQLite он не дублируется как основная «база сотрудников».</w:t>
+        <w:t xml:space="preserve">; в SQLite он не дублируется как основная «база сотрудников». Формат </w:t>
+      </w:r>
+      <w:r>
+        <w:rPr>
+          <w:b/>
+        </w:rPr>
+        <w:t>`.ods`</w:t>
+      </w:r>
+      <w:r>
+        <w:t xml:space="preserve"> поддерживается через </w:t>
+      </w:r>
+      <w:r>
+        <w:rPr>
+          <w:b/>
+        </w:rPr>
+        <w:t>LibreOffice</w:t>
+      </w:r>
+      <w:r>
+        <w:t>.</w:t>
       </w:r>
     </w:p>
     <w:p>
@@ -272,6 +299,15 @@
         <w:t>`Programs_base.xlsx`</w:t>
       </w:r>
       <w:r>
+        <w:t xml:space="preserve"> / </w:t>
+      </w:r>
+      <w:r>
+        <w:rPr>
+          <w:b/>
+        </w:rPr>
+        <w:t>`.ods`</w:t>
+      </w:r>
+      <w:r>
         <w:t xml:space="preserve"> или листы </w:t>
       </w:r>
       <w:r>
@@ -349,6 +385,15 @@
         <w:t>`default_protocol.docx`</w:t>
       </w:r>
       <w:r>
+        <w:t xml:space="preserve">, </w:t>
+      </w:r>
+      <w:r>
+        <w:rPr>
+          <w:b/>
+        </w:rPr>
+        <w:t>`.odt`</w:t>
+      </w:r>
+      <w:r>
         <w:t xml:space="preserve"> или свой </w:t>
       </w:r>
       <w:r>
@@ -376,7 +421,25 @@
         <w:t>«Администрирование» → «Настройки и данные…»</w:t>
       </w:r>
       <w:r>
-        <w:t xml:space="preserve"> → выбор шаблона).</w:t>
+        <w:t xml:space="preserve"> → выбор шаблона). Файлы </w:t>
+      </w:r>
+      <w:r>
+        <w:rPr>
+          <w:b/>
+        </w:rPr>
+        <w:t>`.odt`</w:t>
+      </w:r>
+      <w:r>
+        <w:t xml:space="preserve"> конвертируются в </w:t>
+      </w:r>
+      <w:r>
+        <w:rPr>
+          <w:b/>
+        </w:rPr>
+        <w:t>`.docx`</w:t>
+      </w:r>
+      <w:r>
+        <w:t xml:space="preserve"> при наличии LibreOffice.</w:t>
       </w:r>
     </w:p>
     <w:p>

</xml_diff>